<commit_message>
Fixa a data de saída em 12/06/2026 e ajusta os cálculos dela decorrentes
A data de saída informada substitui a premissa estimada de 10 dias, tornando
determinados o saldo de salário, os avos de 13º e férias e a projeção do
aviso-prévio.

- Saldo de salário passa de 10 para 12 dias: R$ 934,64.
- Projeção dos 60 dias de aviso fixa o término contratual em 11/08/2026,
  confirmando 7/12 de 13º e 6/12 de férias proporcionais (agosto, com 11
  dias, não completa a fração de 15 dias).
- Pedido de CTPS passa a indicar a data de saída a ser anotada (11/08/2026)
  e a baixa como dispensa sem justa causa.
- Acrescenta dedução expressa dos valores quitados no acerto de 12/06/2026,
  restringindo a condenação às diferenças.
- Rescisórias: R$ 22.044,56; reflexos do extrafolha: R$ 14.878,42; multa do
  art. 467: R$ 11.022,28; valor da causa: R$ 257.350,22.

Co-Authored-By: Claude Opus 5 <noreply@anthropic.com>
Claude-Session: https://claude.ai/code/session_0137vgKRtmygYAM5bMKYJV4M
</commit_message>
<xml_diff>
--- a/pecas/ADITAMENTO-GRASIELA-MARTINS-0020592-36.2026.5.04.0384.docx
+++ b/pecas/ADITAMENTO-GRASIELA-MARTINS-0020592-36.2026.5.04.0384.docx
@@ -513,7 +513,7 @@
           <w:i w:val="0"/>
           <w:sz w:val="24"/>
         </w:rPr>
-        <w:t>Data da dispensa:</w:t>
+        <w:t>Data de saída (baixa contratual):</w:t>
       </w:r>
       <w:r>
         <w:rPr>
@@ -522,17 +522,16 @@
           <w:i w:val="0"/>
           <w:sz w:val="24"/>
         </w:rPr>
-        <w:t xml:space="preserve"> junho de 2026, adotando-se, para fins de cálculo estimado, </w:t>
+        <w:t xml:space="preserve"> </w:t>
       </w:r>
       <w:r>
         <w:rPr>
           <w:rFonts w:ascii="Times New Roman" w:hAnsi="Times New Roman" w:cs="Times New Roman"/>
           <w:b/>
           <w:i w:val="0"/>
-          <w:color w:val="FF0000"/>
           <w:sz w:val="24"/>
         </w:rPr>
-        <w:t>[10]</w:t>
+        <w:t>12/06/2026</w:t>
       </w:r>
       <w:r>
         <w:rPr>
@@ -541,17 +540,68 @@
           <w:i w:val="0"/>
           <w:sz w:val="24"/>
         </w:rPr>
-        <w:t xml:space="preserve"> dias trabalhados no mês da rescisão, premissa compatível com o agendamento do pagamento rescisório para 12/06/2026 e com o prazo do art. 477, § 6º, da CLT. </w:t>
+        <w:t xml:space="preserve">, data em que operada a dispensa por justa causa ora impugnada, correspondendo a </w:t>
+      </w:r>
+      <w:r>
+        <w:rPr>
+          <w:rFonts w:ascii="Times New Roman" w:hAnsi="Times New Roman" w:cs="Times New Roman"/>
+          <w:b/>
+          <w:i w:val="0"/>
+          <w:sz w:val="24"/>
+        </w:rPr>
+        <w:t>12 dias trabalhados</w:t>
       </w:r>
       <w:r>
         <w:rPr>
           <w:rFonts w:ascii="Times New Roman" w:hAnsi="Times New Roman" w:cs="Times New Roman"/>
           <w:b w:val="0"/>
           <w:i w:val="0"/>
-          <w:color w:val="FF0000"/>
           <w:sz w:val="24"/>
         </w:rPr>
-        <w:t>[CONFERIR: dia exato da comunicação da dispensa, para ajuste do saldo de salário e da projeção do aviso-prévio.]</w:t>
+        <w:t xml:space="preserve"> no mês da rescisão.</w:t>
+      </w:r>
+    </w:p>
+    <w:p/>
+    <w:p>
+      <w:pPr>
+        <w:ind w:firstLine="850"/>
+        <w:jc w:val="both"/>
+      </w:pPr>
+      <w:r>
+        <w:rPr>
+          <w:rFonts w:ascii="Times New Roman" w:hAnsi="Times New Roman" w:cs="Times New Roman"/>
+          <w:b/>
+          <w:i w:val="0"/>
+          <w:sz w:val="24"/>
+        </w:rPr>
+        <w:t>Termo final do contrato com a projeção do aviso-prévio:</w:t>
+      </w:r>
+      <w:r>
+        <w:rPr>
+          <w:rFonts w:ascii="Times New Roman" w:hAnsi="Times New Roman" w:cs="Times New Roman"/>
+          <w:b w:val="0"/>
+          <w:i w:val="0"/>
+          <w:sz w:val="24"/>
+        </w:rPr>
+        <w:t xml:space="preserve"> revertida a justa causa, os 60 dias de aviso-prévio indenizado projetam o término contratual para </w:t>
+      </w:r>
+      <w:r>
+        <w:rPr>
+          <w:rFonts w:ascii="Times New Roman" w:hAnsi="Times New Roman" w:cs="Times New Roman"/>
+          <w:b/>
+          <w:i w:val="0"/>
+          <w:sz w:val="24"/>
+        </w:rPr>
+        <w:t>11/08/2026</w:t>
+      </w:r>
+      <w:r>
+        <w:rPr>
+          <w:rFonts w:ascii="Times New Roman" w:hAnsi="Times New Roman" w:cs="Times New Roman"/>
+          <w:b w:val="0"/>
+          <w:i w:val="0"/>
+          <w:sz w:val="24"/>
+        </w:rPr>
+        <w:t>, data que passa a ser a de saída para todos os efeitos legais, inclusive anotação em CTPS, 13º salário e férias proporcionais (art. 487, § 1º, da CLT).</w:t>
       </w:r>
     </w:p>
     <w:p/>
@@ -576,7 +626,7 @@
           <w:i w:val="0"/>
           <w:sz w:val="24"/>
         </w:rPr>
-        <w:t xml:space="preserve"> de 01/08/2021 a 30/06/2026, totalizando </w:t>
+        <w:t xml:space="preserve"> de 01/08/2021 a 12/06/2026, totalizando 58 meses completos e 12 dias, </w:t>
       </w:r>
       <w:r>
         <w:rPr>
@@ -585,7 +635,7 @@
           <w:i w:val="0"/>
           <w:sz w:val="24"/>
         </w:rPr>
-        <w:t>59 meses</w:t>
+        <w:t>arredondados para 59 meses</w:t>
       </w:r>
       <w:r>
         <w:rPr>
@@ -921,7 +971,7 @@
           <w:i w:val="0"/>
           <w:sz w:val="24"/>
         </w:rPr>
-        <w:t>Dias efetivamente trabalhados no mês da rescisão, na forma dos arts. 457 e 462 da CLT.</w:t>
+        <w:t>Dias efetivamente trabalhados no mês da rescisão, até a data de saída de 12/06/2026, na forma dos arts. 457 e 462 da CLT.</w:t>
       </w:r>
     </w:p>
     <w:p/>
@@ -937,17 +987,16 @@
           <w:i w:val="0"/>
           <w:sz w:val="24"/>
         </w:rPr>
-        <w:t xml:space="preserve">Cálculo: (R$ 2.336,60 ÷ 30) × </w:t>
+        <w:t xml:space="preserve">Cálculo: (R$ 2.336,60 ÷ 30) × 12 dias = </w:t>
       </w:r>
       <w:r>
         <w:rPr>
           <w:rFonts w:ascii="Times New Roman" w:hAnsi="Times New Roman" w:cs="Times New Roman"/>
-          <w:b w:val="0"/>
+          <w:b/>
           <w:i w:val="0"/>
-          <w:color w:val="FF0000"/>
           <w:sz w:val="24"/>
         </w:rPr>
-        <w:t>[10]</w:t>
+        <w:t>R$ 934,64</w:t>
       </w:r>
       <w:r>
         <w:rPr>
@@ -956,35 +1005,7 @@
           <w:i w:val="0"/>
           <w:sz w:val="24"/>
         </w:rPr>
-        <w:t xml:space="preserve"> dias = </w:t>
-      </w:r>
-      <w:r>
-        <w:rPr>
-          <w:rFonts w:ascii="Times New Roman" w:hAnsi="Times New Roman" w:cs="Times New Roman"/>
-          <w:b/>
-          <w:i w:val="0"/>
-          <w:sz w:val="24"/>
-        </w:rPr>
-        <w:t>R$ 778,87</w:t>
-      </w:r>
-      <w:r>
-        <w:rPr>
-          <w:rFonts w:ascii="Times New Roman" w:hAnsi="Times New Roman" w:cs="Times New Roman"/>
-          <w:b w:val="0"/>
-          <w:i w:val="0"/>
-          <w:sz w:val="24"/>
-        </w:rPr>
-        <w:t xml:space="preserve">. </w:t>
-      </w:r>
-      <w:r>
-        <w:rPr>
-          <w:rFonts w:ascii="Times New Roman" w:hAnsi="Times New Roman" w:cs="Times New Roman"/>
-          <w:b w:val="0"/>
-          <w:i w:val="0"/>
-          <w:color w:val="FF0000"/>
-          <w:sz w:val="24"/>
-        </w:rPr>
-        <w:t>[CÁLCULO A CONFIRMAR conforme o dia exato da dispensa.]</w:t>
+        <w:t>.</w:t>
       </w:r>
     </w:p>
     <w:p/>
@@ -1098,6 +1119,22 @@
           <w:i w:val="0"/>
           <w:sz w:val="24"/>
         </w:rPr>
+        <w:t>Projetado o término contratual para 11/08/2026, contam-se os meses de janeiro a julho de 2026 — o mês de agosto, com apenas 11 dias, não completa a fração de 15 dias exigida —, o que perfaz 7/12 avos.</w:t>
+      </w:r>
+    </w:p>
+    <w:p/>
+    <w:p>
+      <w:pPr>
+        <w:ind w:firstLine="850"/>
+        <w:jc w:val="both"/>
+      </w:pPr>
+      <w:r>
+        <w:rPr>
+          <w:rFonts w:ascii="Times New Roman" w:hAnsi="Times New Roman" w:cs="Times New Roman"/>
+          <w:b w:val="0"/>
+          <w:i w:val="0"/>
+          <w:sz w:val="24"/>
+        </w:rPr>
         <w:t xml:space="preserve">Cálculo: (R$ 2.336,60 ÷ 12) × 7 = </w:t>
       </w:r>
       <w:r>
@@ -1116,17 +1153,7 @@
           <w:i w:val="0"/>
           <w:sz w:val="24"/>
         </w:rPr>
-        <w:t xml:space="preserve">. </w:t>
-      </w:r>
-      <w:r>
-        <w:rPr>
-          <w:rFonts w:ascii="Times New Roman" w:hAnsi="Times New Roman" w:cs="Times New Roman"/>
-          <w:b w:val="0"/>
-          <w:i w:val="0"/>
-          <w:color w:val="FF0000"/>
-          <w:sz w:val="24"/>
-        </w:rPr>
-        <w:t>[CÁLCULO A CONFIRMAR: o número de avos varia conforme o dia exato da dispensa e o termo final da projeção do aviso.]</w:t>
+        <w:t>.</w:t>
       </w:r>
     </w:p>
     <w:p/>
@@ -1234,7 +1261,7 @@
           <w:i w:val="0"/>
           <w:sz w:val="24"/>
         </w:rPr>
-        <w:t>Referentes ao período aquisitivo iniciado em 01/02/2026, computada a projeção do aviso-prévio, o que perfaz 6/12 avos, na forma do art. 146, parágrafo único, da CLT.</w:t>
+        <w:t>Referentes ao período aquisitivo iniciado em 01/02/2026 e encerrado, com a projeção do aviso-prévio, em 11/08/2026 — computando-se os meses de fevereiro a julho, pois os 11 dias de agosto não completam a fração de 15 dias —, o que perfaz 6/12 avos, na forma do art. 146, parágrafo único, da CLT.</w:t>
       </w:r>
     </w:p>
     <w:p/>
@@ -1548,7 +1575,7 @@
           <w:i w:val="0"/>
           <w:sz w:val="24"/>
         </w:rPr>
-        <w:t>R$ 21.888,79</w:t>
+        <w:t>R$ 22.044,56</w:t>
       </w:r>
       <w:r>
         <w:rPr>
@@ -1576,6 +1603,41 @@
           <w:sz w:val="24"/>
         </w:rPr>
         <w:t xml:space="preserve"> a quantia única de R$ 35.000,00 anteriormente atribuída à alínea "d" do rol de pedidos da petição inicial.</w:t>
+      </w:r>
+    </w:p>
+    <w:p/>
+    <w:p>
+      <w:pPr>
+        <w:ind w:firstLine="850"/>
+        <w:jc w:val="both"/>
+      </w:pPr>
+      <w:r>
+        <w:rPr>
+          <w:rFonts w:ascii="Times New Roman" w:hAnsi="Times New Roman" w:cs="Times New Roman"/>
+          <w:b/>
+          <w:i w:val="0"/>
+          <w:sz w:val="24"/>
+        </w:rPr>
+        <w:t>Dedução dos valores já pagos:</w:t>
+      </w:r>
+      <w:r>
+        <w:rPr>
+          <w:rFonts w:ascii="Times New Roman" w:hAnsi="Times New Roman" w:cs="Times New Roman"/>
+          <w:b w:val="0"/>
+          <w:i w:val="0"/>
+          <w:sz w:val="24"/>
+        </w:rPr>
+        <w:t xml:space="preserve"> as parcelas acima são postuladas com a dedução dos valores que a Reclamada comprovar ter efetivamente quitado no acerto realizado em 12/06/2026, restringindo-se a condenação às diferenças apuradas, a fim de que não se postule verba já satisfeita. </w:t>
+      </w:r>
+      <w:r>
+        <w:rPr>
+          <w:rFonts w:ascii="Times New Roman" w:hAnsi="Times New Roman" w:cs="Times New Roman"/>
+          <w:b w:val="0"/>
+          <w:i w:val="0"/>
+          <w:color w:val="FF0000"/>
+          <w:sz w:val="24"/>
+        </w:rPr>
+        <w:t>[CONFERIR: valores efetivamente pagos no TRCT de 12/06/2026, a ser exibido pela Reclamada, para o abatimento correspondente.]</w:t>
       </w:r>
     </w:p>
     <w:p/>
@@ -1777,7 +1839,43 @@
           <w:i w:val="0"/>
           <w:sz w:val="24"/>
         </w:rPr>
-        <w:t xml:space="preserve">Obrigação de fazer, sem conteúdo econômico direto, à qual se atribui, apenas para fins do art. 840, § 1º, da CLT, o valor estimado de </w:t>
+        <w:t xml:space="preserve">Revertida a justa causa, a CTPS deve ser retificada para constar a baixa como </w:t>
+      </w:r>
+      <w:r>
+        <w:rPr>
+          <w:rFonts w:ascii="Times New Roman" w:hAnsi="Times New Roman" w:cs="Times New Roman"/>
+          <w:b/>
+          <w:i w:val="0"/>
+          <w:sz w:val="24"/>
+        </w:rPr>
+        <w:t>dispensa sem justa causa</w:t>
+      </w:r>
+      <w:r>
+        <w:rPr>
+          <w:rFonts w:ascii="Times New Roman" w:hAnsi="Times New Roman" w:cs="Times New Roman"/>
+          <w:b w:val="0"/>
+          <w:i w:val="0"/>
+          <w:sz w:val="24"/>
+        </w:rPr>
+        <w:t xml:space="preserve">, com </w:t>
+      </w:r>
+      <w:r>
+        <w:rPr>
+          <w:rFonts w:ascii="Times New Roman" w:hAnsi="Times New Roman" w:cs="Times New Roman"/>
+          <w:b/>
+          <w:i w:val="0"/>
+          <w:sz w:val="24"/>
+        </w:rPr>
+        <w:t>data de saída em 11/08/2026</w:t>
+      </w:r>
+      <w:r>
+        <w:rPr>
+          <w:rFonts w:ascii="Times New Roman" w:hAnsi="Times New Roman" w:cs="Times New Roman"/>
+          <w:b w:val="0"/>
+          <w:i w:val="0"/>
+          <w:sz w:val="24"/>
+        </w:rPr>
+        <w:t xml:space="preserve">, correspondente à projeção dos 60 dias de aviso-prévio indenizado sobre a data de saída de 12/06/2026 (art. 487, § 1º, da CLT). Obrigação de fazer, sem conteúdo econômico direto, à qual se atribui, apenas para fins do art. 840, § 1º, da CLT, o valor estimado de </w:t>
       </w:r>
       <w:r>
         <w:rPr>
@@ -2216,26 +2314,7 @@
                 <w:i w:val="0"/>
                 <w:sz w:val="22"/>
               </w:rPr>
-              <w:t xml:space="preserve">R$ 700,00 ÷ 30 × </w:t>
-            </w:r>
-            <w:r>
-              <w:rPr>
-                <w:rFonts w:ascii="Times New Roman" w:hAnsi="Times New Roman" w:cs="Times New Roman"/>
-                <w:b w:val="0"/>
-                <w:i w:val="0"/>
-                <w:color w:val="FF0000"/>
-                <w:sz w:val="22"/>
-              </w:rPr>
-              <w:t>[10]</w:t>
-            </w:r>
-            <w:r>
-              <w:rPr>
-                <w:rFonts w:ascii="Times New Roman" w:hAnsi="Times New Roman" w:cs="Times New Roman"/>
-                <w:b w:val="0"/>
-                <w:i w:val="0"/>
-                <w:sz w:val="22"/>
-              </w:rPr>
-              <w:t xml:space="preserve"> dias</w:t>
+              <w:t>R$ 700,00 ÷ 30 × 12 dias</w:t>
             </w:r>
           </w:p>
         </w:tc>
@@ -2255,7 +2334,7 @@
                 <w:i w:val="0"/>
                 <w:sz w:val="22"/>
               </w:rPr>
-              <w:t>R$ 233,33</w:t>
+              <w:t>R$ 280,00</w:t>
             </w:r>
           </w:p>
         </w:tc>
@@ -2440,7 +2519,7 @@
                 <w:i w:val="0"/>
                 <w:sz w:val="22"/>
               </w:rPr>
-              <w:t>R$ 14.831,75</w:t>
+              <w:t>R$ 14.878,42</w:t>
             </w:r>
           </w:p>
         </w:tc>
@@ -4824,7 +4903,7 @@
           <w:i w:val="0"/>
           <w:sz w:val="24"/>
         </w:rPr>
-        <w:t xml:space="preserve">Cálculo: 50% × R$ 21.888,79 = </w:t>
+        <w:t xml:space="preserve">Cálculo: 50% × R$ 22.044,56 = </w:t>
       </w:r>
       <w:r>
         <w:rPr>
@@ -4833,7 +4912,7 @@
           <w:i w:val="0"/>
           <w:sz w:val="24"/>
         </w:rPr>
-        <w:t>R$ 10.944,40</w:t>
+        <w:t>R$ 11.022,28</w:t>
       </w:r>
       <w:r>
         <w:rPr>
@@ -5152,7 +5231,7 @@
                 <w:i w:val="0"/>
                 <w:sz w:val="22"/>
               </w:rPr>
-              <w:t>d) Saldo de salário</w:t>
+              <w:t>d) Saldo de salário (12 dias)</w:t>
             </w:r>
           </w:p>
         </w:tc>
@@ -5172,7 +5251,7 @@
                 <w:i w:val="0"/>
                 <w:sz w:val="22"/>
               </w:rPr>
-              <w:t>R$ 778,87</w:t>
+              <w:t>R$ 934,64</w:t>
             </w:r>
           </w:p>
         </w:tc>
@@ -5530,7 +5609,7 @@
                 <w:i w:val="0"/>
                 <w:sz w:val="22"/>
               </w:rPr>
-              <w:t>m) Retificação/baixa da CTPS com projeção do aviso</w:t>
+              <w:t>m) Retificação/baixa da CTPS, com saída em 11/08/2026</w:t>
             </w:r>
           </w:p>
         </w:tc>
@@ -5634,7 +5713,7 @@
                 <w:i w:val="0"/>
                 <w:sz w:val="22"/>
               </w:rPr>
-              <w:t>R$ 14.831,75</w:t>
+              <w:t>R$ 14.878,42</w:t>
             </w:r>
           </w:p>
         </w:tc>
@@ -6054,7 +6133,7 @@
                 <w:i w:val="0"/>
                 <w:sz w:val="22"/>
               </w:rPr>
-              <w:t>R$ 10.944,40</w:t>
+              <w:t>R$ 11.022,28</w:t>
             </w:r>
           </w:p>
         </w:tc>
@@ -6138,7 +6217,7 @@
                 <w:i w:val="0"/>
                 <w:sz w:val="22"/>
               </w:rPr>
-              <w:t>R$ 257.069,90</w:t>
+              <w:t>R$ 257.350,22</w:t>
             </w:r>
           </w:p>
         </w:tc>
@@ -6250,7 +6329,7 @@
           <w:i w:val="0"/>
           <w:sz w:val="24"/>
         </w:rPr>
-        <w:t>R$ 257.069,90</w:t>
+        <w:t>R$ 257.350,22</w:t>
       </w:r>
       <w:r>
         <w:rPr>
@@ -6327,7 +6406,7 @@
           <w:i w:val="0"/>
           <w:sz w:val="24"/>
         </w:rPr>
-        <w:t xml:space="preserve"> do valor de parcelas que estavam superdimensionadas ou duplicadas: as verbas rescisórias passaram de R$ 35.000,00 para R$ 21.888,79; o pedido de reconhecimento da remuneração real deixou de receber valor autônomo (R$ 28.000,00), por ser declaratório; e o pedido genérico de diferenças de FGTS deixou de receber valor autônomo (R$ 15.000,00), por já estar computado, de forma individualizada, dentro de cada pedido.</w:t>
+        <w:t xml:space="preserve"> do valor de parcelas que estavam superdimensionadas ou duplicadas: as verbas rescisórias passaram de R$ 35.000,00 para R$ 22.044,56; o pedido de reconhecimento da remuneração real deixou de receber valor autônomo (R$ 28.000,00), por ser declaratório; e o pedido genérico de diferenças de FGTS deixou de receber valor autônomo (R$ 15.000,00), por já estar computado, de forma individualizada, dentro de cada pedido.</w:t>
       </w:r>
     </w:p>
     <w:p/>
@@ -6477,7 +6556,7 @@
           <w:i w:val="0"/>
           <w:sz w:val="24"/>
         </w:rPr>
-        <w:t xml:space="preserve"> para R$ 257.069,90, com a devida anotação no sistema processual;</w:t>
+        <w:t xml:space="preserve"> para R$ 257.350,22, com a devida anotação no sistema processual;</w:t>
       </w:r>
     </w:p>
     <w:p/>

</xml_diff>